<commit_message>
Remove legacy automatic edge detection and align code, report, and presentation with interactive 4-dot homography and pipeline memory
</commit_message>
<xml_diff>
--- a/Scanify_Simple_Project_Report (1).docx
+++ b/Scanify_Simple_Project_Report (1).docx
@@ -32,7 +32,7 @@
     </w:p>
     <w:p>
       <w:r>
-        <w:t>Scanify is a document-scanning application that turns photographs of paper documents into clearer, straighter digital copies. A photo taken with a phone may be tilted, shadowed, noisy, or difficult to read. Scanify uses Python, OpenCV, NumPy, and Streamlit to address these problems through a sequence of image-processing steps. It detects the paper boundaries and corrects perspective, reduces noise, improves contrast, adjusts uneven lighting, and can turn a page into a black-and-white image. Users can view the original and processed images and combine multiple pages into a PDF. The project demonstrates how basic computer-vision techniques can solve a practical everyday problem. Testing described in the project report showed useful improvements for tilted pages, shadows, faded receipts, and noisy images. The system can still struggle when the paper edge is hard to distinguish from the background or when a page is curved or blurred.</w:t>
+        <w:t>Scanify is a document-scanning application that turns photographs of paper documents into clearer, straighter digital copies. A photo taken with a phone may be tilted, shadowed, noisy, or difficult to read. Scanify uses Python, OpenCV, NumPy, and Streamlit to address these problems through an interactive, sequential image-processing pipeline. It enables users to manually position four draggable corner markers to rectify perspective distortion via 2D planar homography, provides a pipeline state memory ('Keep' and 'Revert') to chain multiple operations without losing intermediate progress, reduces noise, improves contrast, adjusts uneven lighting, and turns pages into high-contrast black-and-white documents. Users can view real-time side-by-side comparisons, inspect intensity histograms, and combine multiple processed pages into a single PDF. By replacing fragile automatic edge detection with robust user-guided corner positioning, the system reliably handles documents on low-contrast backgrounds while demonstrating core Image Processing and Computer Vision concepts.</w:t>
       </w:r>
     </w:p>
     <w:p>
@@ -66,7 +66,7 @@
         <w:pStyle w:val="ListBullet"/>
       </w:pPr>
       <w:r>
-        <w:t>Detect the four corners of a document and straighten a tilted photograph.</w:t>
+        <w:t>Rectify perspective distortion from tilted photographs into flat rectangular copies using an interactive four-corner homography crop box.</w:t>
       </w:r>
     </w:p>
     <w:p>
@@ -137,17 +137,17 @@
         <w:pStyle w:val="Heading2"/>
       </w:pPr>
       <w:r>
-        <w:t>2.2 Detecting and straightening the page</w:t>
+        <w:t>2.2 Straightening the page using interactive 4-corner homography</w:t>
       </w:r>
     </w:p>
     <w:p>
       <w:r>
-        <w:t>First, the image is converted to grayscale for easier edge detection. A small amount of smoothing reduces tiny details that could confuse the detector. Canny edge detection then identifies strong boundaries, and contour detection looks for a large, roughly four-sided shape that may represent the paper.</w:t>
+        <w:t>Early prototypes explored automated boundary detection using Canny edge filtering and Douglas-Peucker polygonal contour approximation. However, practical testing demonstrated that automatic edge detection frequently failed when document boundaries blended into tablecloths, desk surfaces, or non-uniform background shadows. To ensure dependable performance across any environment, Scanify implements an interactive four-corner homography approach.</w:t>
       </w:r>
     </w:p>
     <w:p>
       <w:r>
-        <w:t>Once the four corners are found, the application places them in the correct order and uses a perspective transformation to map the tilted page into a rectangular view. In simple terms, it digitally changes the viewpoint so the document looks more like it would if photographed from directly above. If the paper boundary is unclear, automatic detection may not work correctly.</w:t>
+        <w:t>The user is presented with a 60-fps interactive HTML5 canvas displaying the document with four draggable colored control points (Top-Left, Top-Right, Bottom-Left, Bottom-Right). Once positioned on the document corners, the coordinates are topologically ordered via coordinate sum and difference projections. A 3x3 projective homography transformation matrix is computed using cv2.getPerspectiveTransform and applied via bilinear interpolation (cv2.warpPerspective) to map the arbitrary tilted quadrilateral into an upright, front-facing rectangular view. This guarantees complete geometric rectification regardless of background contrast.</w:t>
       </w:r>
     </w:p>
     <w:p>
@@ -199,12 +199,12 @@
         <w:pStyle w:val="Heading2"/>
       </w:pPr>
       <w:r>
-        <w:t>2.6 Interface and PDF output</w:t>
+        <w:t>2.6 Interface, pipeline memory, and PDF output</w:t>
       </w:r>
     </w:p>
     <w:p>
       <w:r>
-        <w:t>The Streamlit interface allows users to choose a processing operation, adjust available settings, and compare the original and processed images. It can also display an image-intensity histogram, which shows how dark and bright pixels are distributed. After processing multiple pages, the application can combine them into one PDF document.</w:t>
+        <w:t>The Streamlit interface provides beginner-friendly tools with side-by-side original and processed views. A critical feature of Scanify is its sequential pipeline memory system: switching between dropdown tools would normally discard earlier modifications. Scanify introduces 'Keep This Result' and 'Remove / Revert' controls for each page, alongside global 'Keep All' and 'Reset All' controls. When a user is satisfied with a stage (such as perspective straightening), clicking 'Keep' appends the result to a session history stack, locking it in as the input for subsequent tools (such as noise filtering or adaptive thresholding). The application also incorporates a channel-invariant pipeline architecture (ensure_bgr) that guarantees seamless transitions between color, grayscale, and binary thresholded states without OpenCV channel mismatch errors. Finally, users can inspect 256-bin intensity histograms and download all processed pages compiled in-memory into a single PDF.</w:t>
       </w:r>
     </w:p>
     <w:p>
@@ -280,7 +280,7 @@
           </w:tcPr>
           <w:p>
             <w:r>
-              <w:t>Corner detection and perspective correction</w:t>
+              <w:t>Interactive 4-point perspective homography rectification</w:t>
             </w:r>
           </w:p>
         </w:tc>
@@ -290,7 +290,7 @@
           </w:tcPr>
           <w:p>
             <w:r>
-              <w:t>The page was straightened into a rectangular view.</w:t>
+              <w:t>The tilted page was straightened into a flat rectangular scan regardless of background contrast.</w:t>
             </w:r>
           </w:p>
         </w:tc>
@@ -423,6 +423,38 @@
           </w:p>
         </w:tc>
       </w:tr>
+      <w:tr>
+        <w:tc>
+          <w:tcPr>
+            <w:tcW w:type="dxa" w:w="3312"/>
+          </w:tcPr>
+          <w:p>
+            <w:r>
+              <w:t>Multi-stage processing</w:t>
+            </w:r>
+          </w:p>
+        </w:tc>
+        <w:tc>
+          <w:tcPr>
+            <w:tcW w:type="dxa" w:w="3312"/>
+          </w:tcPr>
+          <w:p>
+            <w:r>
+              <w:t>Pipeline state memory (Keep &amp; Revert system)</w:t>
+            </w:r>
+          </w:p>
+        </w:tc>
+        <w:tc>
+          <w:tcPr>
+            <w:tcW w:type="dxa" w:w="3312"/>
+          </w:tcPr>
+          <w:p>
+            <w:r>
+              <w:t>Users chained straightening, noise reduction, and thresholding sequentially into a finished scan without losing steps.</w:t>
+            </w:r>
+          </w:p>
+        </w:tc>
+      </w:tr>
     </w:tbl>
     <w:p>
       <w:pPr>
@@ -455,7 +487,7 @@
         <w:pStyle w:val="ListBullet"/>
       </w:pPr>
       <w:r>
-        <w:t>If the paper and the table have similar colours, the application may have difficulty finding the page corners.</w:t>
+        <w:t>Low-contrast backgrounds no longer cause detection failures because corner placement is guided interactively by the user.</w:t>
       </w:r>
     </w:p>
     <w:p>
@@ -523,7 +555,7 @@
         <w:pStyle w:val="ListNumber"/>
       </w:pPr>
       <w:r>
-        <w:t>Canny, J. (1986). A Computational Approach to Edge Detection. IEEE Transactions on Pattern Analysis and Machine Intelligence, 8(6), 679–698.</w:t>
+        <w:t>Hartley, R., &amp; Zisserman, A. (2003). Multiple View Geometry in Computer Vision (2nd ed.). Cambridge University Press.</w:t>
       </w:r>
     </w:p>
     <w:p>

</xml_diff>